<commit_message>
Mise a jour des graphiques dans le rapport
</commit_message>
<xml_diff>
--- a/rapport.docx
+++ b/rapport.docx
@@ -280,15 +280,7 @@
         </w:numPr>
       </w:pPr>
       <w:r>
-        <w:t>Programmation linéaire (</w:t>
-      </w:r>
-      <w:proofErr w:type="spellStart"/>
-      <w:r>
-        <w:t>PuLP</w:t>
-      </w:r>
-      <w:proofErr w:type="spellEnd"/>
-      <w:r>
-        <w:t xml:space="preserve">) </w:t>
+        <w:t xml:space="preserve">Programmation linéaire (PuLP) </w:t>
       </w:r>
     </w:p>
     <w:p>
@@ -327,23 +319,7 @@
           <w:b/>
           <w:bCs/>
         </w:rPr>
-        <w:t>2. Partie 1 — Programmation linéaire (</w:t>
-      </w:r>
-      <w:proofErr w:type="spellStart"/>
-      <w:r>
-        <w:rPr>
-          <w:b/>
-          <w:bCs/>
-        </w:rPr>
-        <w:t>PuLP</w:t>
-      </w:r>
-      <w:proofErr w:type="spellEnd"/>
-      <w:r>
-        <w:rPr>
-          <w:b/>
-          <w:bCs/>
-        </w:rPr>
-        <w:t>)</w:t>
+        <w:t>2. Partie 1 — Programmation linéaire (PuLP)</w:t>
       </w:r>
     </w:p>
     <w:p>
@@ -585,6 +561,9 @@
             <m:t>)</m:t>
           </m:r>
           <m:r>
+            <m:rPr>
+              <m:sty m:val="p"/>
+            </m:rPr>
             <w:br/>
           </m:r>
         </m:oMath>
@@ -672,6 +651,9 @@
             <m:t>≤1</m:t>
           </m:r>
           <m:r>
+            <m:rPr>
+              <m:sty m:val="p"/>
+            </m:rPr>
             <w:br/>
           </m:r>
         </m:oMath>
@@ -802,6 +784,9 @@
             <m:t>=3</m:t>
           </m:r>
           <m:r>
+            <m:rPr>
+              <m:sty m:val="p"/>
+            </m:rPr>
             <w:br/>
           </m:r>
         </m:oMath>
@@ -945,6 +930,9 @@
             <m:t>)≤8500</m:t>
           </m:r>
           <m:r>
+            <m:rPr>
+              <m:sty m:val="p"/>
+            </m:rPr>
             <w:br/>
           </m:r>
         </m:oMath>
@@ -1051,6 +1039,9 @@
             <m:t>≤250</m:t>
           </m:r>
           <m:r>
+            <m:rPr>
+              <m:sty m:val="p"/>
+            </m:rPr>
             <w:br/>
           </m:r>
         </m:oMath>
@@ -1142,6 +1133,9 @@
             <m:t>≤250</m:t>
           </m:r>
           <m:r>
+            <m:rPr>
+              <m:sty m:val="p"/>
+            </m:rPr>
             <w:br/>
           </m:r>
         </m:oMath>
@@ -1423,13 +1417,8 @@
             <w:hideMark/>
           </w:tcPr>
           <w:p>
-            <w:proofErr w:type="spellStart"/>
             <w:r>
-              <w:t>PuLP</w:t>
-            </w:r>
-            <w:proofErr w:type="spellEnd"/>
-            <w:r>
-              <w:t xml:space="preserve"> (optimal)</w:t>
+              <w:t>PuLP (optimal)</w:t>
             </w:r>
           </w:p>
         </w:tc>
@@ -1492,27 +1481,14 @@
           <w:numId w:val="12"/>
         </w:numPr>
       </w:pPr>
-      <w:proofErr w:type="spellStart"/>
-      <w:r>
-        <w:t>PuLP</w:t>
-      </w:r>
-      <w:proofErr w:type="spellEnd"/>
-      <w:r>
-        <w:t xml:space="preserve"> donne la meilleure solution </w:t>
+      <w:r>
+        <w:t xml:space="preserve">PuLP donne la meilleure solution </w:t>
       </w:r>
     </w:p>
     <w:p>
       <w:r>
         <w:lastRenderedPageBreak/>
-        <w:t xml:space="preserve">Personnellement, je pensais que la stratégie gloutonne allait donner un résultat optimal, mais en comparant avec </w:t>
-      </w:r>
-      <w:proofErr w:type="spellStart"/>
-      <w:r>
-        <w:t>PuLP</w:t>
-      </w:r>
-      <w:proofErr w:type="spellEnd"/>
-      <w:r>
-        <w:t>, j’ai constaté qu’elle peut faire des choix non optimaux.</w:t>
+        <w:t>Personnellement, je pensais que la stratégie gloutonne allait donner un résultat optimal, mais en comparant avec PuLP, j’ai constaté qu’elle peut faire des choix non optimaux.</w:t>
       </w:r>
     </w:p>
     <w:p>
@@ -1654,6 +1630,9 @@
             <m:t>cumule(joueurs,k-1)</m:t>
           </m:r>
           <m:r>
+            <m:rPr>
+              <m:sty m:val="p"/>
+            </m:rPr>
             <w:br/>
           </m:r>
         </m:oMath>
@@ -1665,46 +1644,20 @@
       </w:r>
     </w:p>
     <w:p>
-      <w:proofErr w:type="spellStart"/>
-      <w:r>
-        <w:t>score_cumule</w:t>
-      </w:r>
-      <w:proofErr w:type="spellEnd"/>
-      <w:r>
-        <w:t>(joueurs, 0) = 0</w:t>
+      <w:r>
+        <w:t>score_cumule(joueurs, 0) = 0</w:t>
       </w:r>
       <w:r>
         <w:br/>
-      </w:r>
-      <w:proofErr w:type="spellStart"/>
-      <w:r>
-        <w:t>score_cumule</w:t>
-      </w:r>
-      <w:proofErr w:type="spellEnd"/>
-      <w:r>
-        <w:t>(joueurs, 1) = 93</w:t>
+        <w:t>score_cumule(joueurs, 1) = 93</w:t>
       </w:r>
       <w:r>
         <w:br/>
-      </w:r>
-      <w:proofErr w:type="spellStart"/>
-      <w:r>
-        <w:t>score_cumule</w:t>
-      </w:r>
-      <w:proofErr w:type="spellEnd"/>
-      <w:r>
-        <w:t>(joueurs, 2) = 184</w:t>
+        <w:t>score_cumule(joueurs, 2) = 184</w:t>
       </w:r>
       <w:r>
         <w:br/>
-      </w:r>
-      <w:proofErr w:type="spellStart"/>
-      <w:r>
-        <w:t>score_cumule</w:t>
-      </w:r>
-      <w:proofErr w:type="spellEnd"/>
-      <w:r>
-        <w:t>(joueurs, 3) = 273</w:t>
+        <w:t>score_cumule(joueurs, 3) = 273</w:t>
       </w:r>
     </w:p>
     <w:p/>
@@ -1830,13 +1783,8 @@
           <w:numId w:val="16"/>
         </w:numPr>
       </w:pPr>
-      <w:proofErr w:type="spellStart"/>
-      <w:r>
-        <w:t>fib_naif</w:t>
-      </w:r>
-      <w:proofErr w:type="spellEnd"/>
-      <w:r>
-        <w:t xml:space="preserve"> : très lent (~4 secondes) </w:t>
+      <w:r>
+        <w:t xml:space="preserve">fib_naif : très lent (~4 secondes) </w:t>
       </w:r>
     </w:p>
     <w:p>
@@ -1846,13 +1794,8 @@
           <w:numId w:val="16"/>
         </w:numPr>
       </w:pPr>
-      <w:proofErr w:type="spellStart"/>
-      <w:r>
-        <w:t>fib_memo</w:t>
-      </w:r>
-      <w:proofErr w:type="spellEnd"/>
-      <w:r>
-        <w:t xml:space="preserve"> : très rapide (~0.00005 s) </w:t>
+      <w:r>
+        <w:t xml:space="preserve">fib_memo : très rapide (~0.00005 s) </w:t>
       </w:r>
     </w:p>
     <w:p>
@@ -1953,11 +1896,9 @@
             <w:hideMark/>
           </w:tcPr>
           <w:p>
-            <w:proofErr w:type="spellStart"/>
             <w:r>
               <w:t>fib_naif</w:t>
             </w:r>
-            <w:proofErr w:type="spellEnd"/>
           </w:p>
         </w:tc>
         <w:tc>
@@ -1984,11 +1925,9 @@
             <w:hideMark/>
           </w:tcPr>
           <w:p>
-            <w:proofErr w:type="spellStart"/>
             <w:r>
               <w:t>fib_memo</w:t>
             </w:r>
-            <w:proofErr w:type="spellEnd"/>
           </w:p>
         </w:tc>
         <w:tc>
@@ -2045,16 +1984,14 @@
       </w:pPr>
       <w:r>
         <w:rPr>
-          <w:b/>
-          <w:bCs/>
           <w:noProof/>
         </w:rPr>
         <w:lastRenderedPageBreak/>
         <w:drawing>
-          <wp:inline distT="0" distB="0" distL="0" distR="0" wp14:anchorId="6C4BCDD3" wp14:editId="645FD62F">
-            <wp:extent cx="5972810" cy="4504690"/>
-            <wp:effectExtent l="0" t="0" r="8890" b="0"/>
-            <wp:docPr id="1687705946" name="Image 2"/>
+          <wp:inline distT="0" distB="0" distL="0" distR="0" wp14:anchorId="02D109D8" wp14:editId="27C6012B">
+            <wp:extent cx="5852160" cy="4389120"/>
+            <wp:effectExtent l="0" t="0" r="0" b="0"/>
+            <wp:docPr id="1456065601" name="Image 2"/>
             <wp:cNvGraphicFramePr>
               <a:graphicFrameLocks xmlns:a="http://schemas.openxmlformats.org/drawingml/2006/main" noChangeAspect="1"/>
             </wp:cNvGraphicFramePr>
@@ -2062,7 +1999,7 @@
               <a:graphicData uri="http://schemas.openxmlformats.org/drawingml/2006/picture">
                 <pic:pic xmlns:pic="http://schemas.openxmlformats.org/drawingml/2006/picture">
                   <pic:nvPicPr>
-                    <pic:cNvPr id="0" name="Picture 132"/>
+                    <pic:cNvPr id="0" name="Picture 4"/>
                     <pic:cNvPicPr>
                       <a:picLocks noChangeAspect="1" noChangeArrowheads="1"/>
                     </pic:cNvPicPr>
@@ -2083,7 +2020,7 @@
                   <pic:spPr bwMode="auto">
                     <a:xfrm>
                       <a:off x="0" y="0"/>
-                      <a:ext cx="5972810" cy="4504690"/>
+                      <a:ext cx="5852160" cy="4389120"/>
                     </a:xfrm>
                     <a:prstGeom prst="rect">
                       <a:avLst/>
@@ -2120,13 +2057,8 @@
           <w:numId w:val="17"/>
         </w:numPr>
       </w:pPr>
-      <w:proofErr w:type="spellStart"/>
-      <w:r>
-        <w:t>PuLP</w:t>
-      </w:r>
-      <w:proofErr w:type="spellEnd"/>
-      <w:r>
-        <w:t xml:space="preserve"> est optimal </w:t>
+      <w:r>
+        <w:t xml:space="preserve">PuLP est optimal </w:t>
       </w:r>
     </w:p>
     <w:p>
@@ -2154,7 +2086,7 @@
     <w:p>
       <w:r>
         <w:pict w14:anchorId="45869950">
-          <v:rect id="_x0000_i1030" style="width:0;height:1.5pt" o:hralign="center" o:hrstd="t" o:hr="t" fillcolor="#a0a0a0" stroked="f"/>
+          <v:rect id="_x0000_i1025" style="width:0;height:1.5pt" o:hralign="center" o:hrstd="t" o:hr="t" fillcolor="#a0a0a0" stroked="f"/>
         </w:pict>
       </w:r>
     </w:p>
@@ -2190,16 +2122,14 @@
       </w:pPr>
       <w:r>
         <w:rPr>
-          <w:b/>
-          <w:bCs/>
           <w:noProof/>
         </w:rPr>
         <w:lastRenderedPageBreak/>
         <w:drawing>
-          <wp:inline distT="0" distB="0" distL="0" distR="0" wp14:anchorId="5579F6AF" wp14:editId="4FA16E58">
-            <wp:extent cx="5972810" cy="4509135"/>
-            <wp:effectExtent l="0" t="0" r="8890" b="5715"/>
-            <wp:docPr id="1511646658" name="Image 4"/>
+          <wp:inline distT="0" distB="0" distL="0" distR="0" wp14:anchorId="7F1117FB" wp14:editId="389368F7">
+            <wp:extent cx="5852160" cy="4389120"/>
+            <wp:effectExtent l="0" t="0" r="0" b="0"/>
+            <wp:docPr id="40476235" name="Image 3"/>
             <wp:cNvGraphicFramePr>
               <a:graphicFrameLocks xmlns:a="http://schemas.openxmlformats.org/drawingml/2006/main" noChangeAspect="1"/>
             </wp:cNvGraphicFramePr>
@@ -2207,7 +2137,7 @@
               <a:graphicData uri="http://schemas.openxmlformats.org/drawingml/2006/picture">
                 <pic:pic xmlns:pic="http://schemas.openxmlformats.org/drawingml/2006/picture">
                   <pic:nvPicPr>
-                    <pic:cNvPr id="0" name="Picture 139"/>
+                    <pic:cNvPr id="0" name="Picture 6"/>
                     <pic:cNvPicPr>
                       <a:picLocks noChangeAspect="1" noChangeArrowheads="1"/>
                     </pic:cNvPicPr>
@@ -2228,7 +2158,7 @@
                   <pic:spPr bwMode="auto">
                     <a:xfrm>
                       <a:off x="0" y="0"/>
-                      <a:ext cx="5972810" cy="4509135"/>
+                      <a:ext cx="5852160" cy="4389120"/>
                     </a:xfrm>
                     <a:prstGeom prst="rect">
                       <a:avLst/>
@@ -2265,13 +2195,8 @@
           <w:numId w:val="18"/>
         </w:numPr>
       </w:pPr>
-      <w:proofErr w:type="spellStart"/>
-      <w:r>
-        <w:t>fib_naif</w:t>
-      </w:r>
-      <w:proofErr w:type="spellEnd"/>
-      <w:r>
-        <w:t xml:space="preserve"> explose exponentiellement </w:t>
+      <w:r>
+        <w:t xml:space="preserve">fib_naif explose exponentiellement </w:t>
       </w:r>
     </w:p>
     <w:p>
@@ -2281,13 +2206,8 @@
           <w:numId w:val="18"/>
         </w:numPr>
       </w:pPr>
-      <w:proofErr w:type="spellStart"/>
-      <w:r>
-        <w:t>fib_memo</w:t>
-      </w:r>
-      <w:proofErr w:type="spellEnd"/>
-      <w:r>
-        <w:t xml:space="preserve"> reste faible </w:t>
+      <w:r>
+        <w:t xml:space="preserve">fib_memo reste faible </w:t>
       </w:r>
     </w:p>
     <w:p>
@@ -2557,15 +2477,7 @@
     </w:p>
     <w:p>
       <w:r>
-        <w:t>La programmation linéaire (</w:t>
-      </w:r>
-      <w:proofErr w:type="spellStart"/>
-      <w:r>
-        <w:t>PuLP</w:t>
-      </w:r>
-      <w:proofErr w:type="spellEnd"/>
-      <w:r>
-        <w:t>) donne la meilleure solution car elle explore toutes les possibilités.</w:t>
+        <w:t>La programmation linéaire (PuLP) donne la meilleure solution car elle explore toutes les possibilités.</w:t>
       </w:r>
     </w:p>
     <w:p>
@@ -2607,15 +2519,7 @@
       </w:pPr>
       <w:r>
         <w:lastRenderedPageBreak/>
-        <w:t xml:space="preserve">utiliser </w:t>
-      </w:r>
-      <w:proofErr w:type="spellStart"/>
-      <w:r>
-        <w:t>PuLP</w:t>
-      </w:r>
-      <w:proofErr w:type="spellEnd"/>
-      <w:r>
-        <w:t xml:space="preserve"> pour la précision </w:t>
+        <w:t xml:space="preserve">utiliser PuLP pour la précision </w:t>
       </w:r>
     </w:p>
     <w:p>
@@ -2654,23 +2558,7 @@
     </w:p>
     <w:p>
       <w:r>
-        <w:t xml:space="preserve">Personnellement, j’ai trouvé la programmation dynamique plus difficile à comprendre au début, mais elle est très efficace une fois appliquée. La différence entre </w:t>
-      </w:r>
-      <w:proofErr w:type="spellStart"/>
-      <w:r>
-        <w:t>fib_naif</w:t>
-      </w:r>
-      <w:proofErr w:type="spellEnd"/>
-      <w:r>
-        <w:t xml:space="preserve"> et </w:t>
-      </w:r>
-      <w:proofErr w:type="spellStart"/>
-      <w:r>
-        <w:t>fib_memo</w:t>
-      </w:r>
-      <w:proofErr w:type="spellEnd"/>
-      <w:r>
-        <w:t xml:space="preserve"> m’a vraiment surpris, car le temps de calcul change énormément. Cela m’a permis de mieux comprendre l’importance d’optimiser les calculs.</w:t>
+        <w:t>Personnellement, j’ai trouvé la programmation dynamique plus difficile à comprendre au début, mais elle est très efficace une fois appliquée. La différence entre fib_naif et fib_memo m’a vraiment surpris, car le temps de calcul change énormément. Cela m’a permis de mieux comprendre l’importance d’optimiser les calculs.</w:t>
       </w:r>
     </w:p>
     <w:sectPr>
@@ -6483,6 +6371,7 @@
   <w:style w:type="character" w:default="1" w:styleId="Policepardfaut">
     <w:name w:val="Default Paragraph Font"/>
     <w:uiPriority w:val="1"/>
+    <w:semiHidden/>
     <w:unhideWhenUsed/>
   </w:style>
   <w:style w:type="table" w:default="1" w:styleId="TableauNormal">

</xml_diff>